<commit_message>
docs: correct commit/push status in the Feishu report
The report still said the code was uncommitted. Record the pushed branch
and refresh the docx backup.

Co-Authored-By: Claude Code <noreply@anthropic.com>
</commit_message>
<xml_diff>
--- a/FEISHU_REPORT.docx
+++ b/FEISHU_REPORT.docx
@@ -11792,16 +11792,58 @@
         <w:rPr>
           <w:rFonts w:hint="eastAsia"/>
         </w:rPr>
-        <w:t xml:space="preserve">代码改动未</w:t>
-      </w:r>
-      <w:r>
-        <w:t xml:space="preserve"> </w:t>
-      </w:r>
-      <w:r>
-        <w:rPr>
-          <w:rFonts w:hint="eastAsia"/>
-        </w:rPr>
-        <w:t xml:space="preserve">commit/push；原始预测/头结果在</w:t>
+        <w:t xml:space="preserve">代码与报告已提交并推送到</w:t>
+      </w:r>
+      <w:r>
+        <w:t xml:space="preserve"> </w:t>
+      </w:r>
+      <w:r>
+        <w:rPr>
+          <w:rStyle w:val="VerbatimChar"/>
+        </w:rPr>
+        <w:t xml:space="preserve">feasibility/pilot-fixes</w:t>
+      </w:r>
+      <w:r>
+        <w:t xml:space="preserve"> </w:t>
+      </w:r>
+      <w:r>
+        <w:rPr>
+          <w:rFonts w:hint="eastAsia"/>
+        </w:rPr>
+        <w:t xml:space="preserve">分支（commit</w:t>
+      </w:r>
+      <w:r>
+        <w:t xml:space="preserve"> </w:t>
+      </w:r>
+      <w:r>
+        <w:rPr>
+          <w:rStyle w:val="VerbatimChar"/>
+        </w:rPr>
+        <w:t xml:space="preserve">2715637</w:t>
+      </w:r>
+      <w:r>
+        <w:t xml:space="preserve">、</w:t>
+      </w:r>
+      <w:r>
+        <w:rPr>
+          <w:rStyle w:val="VerbatimChar"/>
+        </w:rPr>
+        <w:t xml:space="preserve">561b418</w:t>
+      </w:r>
+      <w:r>
+        <w:t xml:space="preserve">、</w:t>
+      </w:r>
+      <w:r>
+        <w:rPr>
+          <w:rStyle w:val="VerbatimChar"/>
+        </w:rPr>
+        <w:t xml:space="preserve">89e8a25</w:t>
+      </w:r>
+      <w:r>
+        <w:rPr>
+          <w:rFonts w:hint="eastAsia"/>
+        </w:rPr>
+        <w:t xml:space="preserve">）；原始预测/头结果在</w:t>
       </w:r>
       <w:r>
         <w:t xml:space="preserve"> </w:t>
@@ -18133,25 +18175,58 @@
         <w:rPr>
           <w:rFonts w:hint="eastAsia"/>
         </w:rPr>
-        <w:t xml:space="preserve">。所有代码改动</w:t>
-      </w:r>
-      <w:r>
-        <w:rPr>
-          <w:rFonts w:hint="eastAsia"/>
-          <w:b/>
-          <w:bCs/>
-        </w:rPr>
-        <w:t xml:space="preserve">未</w:t>
-      </w:r>
-      <w:r>
-        <w:rPr>
-          <w:b/>
-          <w:bCs/>
-        </w:rPr>
-        <w:t xml:space="preserve"> commit/push</w:t>
-      </w:r>
-      <w:r>
-        <w:t xml:space="preserve">。</w:t>
+        <w:t xml:space="preserve">。代码与报告已提交并推送到</w:t>
+      </w:r>
+      <w:r>
+        <w:t xml:space="preserve"> </w:t>
+      </w:r>
+      <w:r>
+        <w:rPr>
+          <w:rStyle w:val="VerbatimChar"/>
+        </w:rPr>
+        <w:t xml:space="preserve">feasibility/pilot-fixes</w:t>
+      </w:r>
+      <w:r>
+        <w:t xml:space="preserve"> </w:t>
+      </w:r>
+      <w:r>
+        <w:rPr>
+          <w:rFonts w:hint="eastAsia"/>
+        </w:rPr>
+        <w:t xml:space="preserve">分支（commit</w:t>
+      </w:r>
+      <w:r>
+        <w:t xml:space="preserve"> </w:t>
+      </w:r>
+      <w:r>
+        <w:rPr>
+          <w:rStyle w:val="VerbatimChar"/>
+        </w:rPr>
+        <w:t xml:space="preserve">2715637</w:t>
+      </w:r>
+      <w:r>
+        <w:t xml:space="preserve">、</w:t>
+      </w:r>
+      <w:r>
+        <w:rPr>
+          <w:rStyle w:val="VerbatimChar"/>
+        </w:rPr>
+        <w:t xml:space="preserve">561b418</w:t>
+      </w:r>
+      <w:r>
+        <w:t xml:space="preserve">、</w:t>
+      </w:r>
+      <w:r>
+        <w:rPr>
+          <w:rStyle w:val="VerbatimChar"/>
+        </w:rPr>
+        <w:t xml:space="preserve">89e8a25</w:t>
+      </w:r>
+      <w:r>
+        <w:rPr>
+          <w:rFonts w:hint="eastAsia"/>
+        </w:rPr>
+        <w:t xml:space="preserve">）。</w:t>
       </w:r>
     </w:p>
     <w:p>

</xml_diff>